<commit_message>
Fix concluzii placeholder swallowed by cinetica second-line rule
Cinetica had two ~177-dot runs and concluzii a single ~874-dot run; the
permissive {100,} match was consuming both cinetica lines and leaving the
concluzii dots untouched. Use length-bounded ranges and add a "clear" rule
that empties the second cinetica line.

Co-Authored-By: Claude Opus 4.7 <noreply@anthropic.com>
</commit_message>
<xml_diff>
--- a/templates/template.docx
+++ b/templates/template.docx
@@ -2072,7 +2072,7 @@
           <w:szCs w:val="22"/>
           <w:lang w:val="ro-RO"/>
         </w:rPr>
-        <w:t>{concluzii}</w:t>
+        <w:t/>
       </w:r>
       <w:r>
         <w:rPr>
@@ -2452,7 +2452,7 @@
           <w:rFonts w:cs="Calibri" w:ascii="Calibri" w:hAnsi="Calibri"/>
           <w:lang w:val="ro-RO"/>
         </w:rPr>
-        <w:t>..........................................................................................................................................................................................................................................................................................................................................................................................................................................................................................................................................................................................................................................................................................................................................................................................................................................................................................................</w:t>
+        <w:t>{concluzii}</w:t>
       </w:r>
     </w:p>
     <w:tbl>

</xml_diff>

<commit_message>
Center medic title under doctor name; bullet diagnostice/recomandari/tratament
- New centered <w:p> paragraph below the Medic examinator line carries the
  doctor's title (no more inline linebreak that inherited weird alignment)
- Diagnostice/Recomandari/Tratament now render the user's value on a new line
  below the label, with each line prefixed by "- "
- Empty values for these four fields render as empty (no underscores)

Co-Authored-By: Claude Opus 4.7 <noreply@anthropic.com>
</commit_message>
<xml_diff>
--- a/templates/template.docx
+++ b/templates/template.docx
@@ -2671,6 +2671,21 @@
         <w:t xml:space="preserve">Medic examinator: {medic_examinator}                                                                                                                                                     </w:t>
       </w:r>
     </w:p>
+    <w:p>
+      <w:pPr>
+        <w:pStyle w:val="Normal"/>
+        <w:jc w:val="center"/>
+        <w:rPr/>
+      </w:pPr>
+      <w:r>
+        <w:rPr>
+          <w:rFonts w:cs="Calibri" w:ascii="Calibri" w:hAnsi="Calibri"/>
+          <w:b/>
+          <w:lang w:val="ro-RO"/>
+        </w:rPr>
+        <w:t>{medic_titlu}</w:t>
+      </w:r>
+    </w:p>
     <w:sectPr>
       <w:type w:val="nextPage"/>
       <w:pgSz w:w="11906" w:h="16838"/>

</xml_diff>

<commit_message>
Center medic name + title as a stacked block
Replace the original right-shifted "Medic examinator:" paragraph (it used
trailing whitespace + a negative w:ind to push to the right) with a clean
centered paragraph, matching the title paragraph below it. Apply the same
center alignment to the print/PDF view.

Co-Authored-By: Claude Opus 4.7 <noreply@anthropic.com>
</commit_message>
<xml_diff>
--- a/templates/template.docx
+++ b/templates/template.docx
@@ -2650,8 +2650,7 @@
     <w:p>
       <w:pPr>
         <w:pStyle w:val="Normal"/>
-        <w:spacing w:lineRule="auto" w:line="360"/>
-        <w:ind w:end="-1260"/>
+        <w:jc w:val="center"/>
         <w:rPr/>
       </w:pPr>
       <w:r>
@@ -2660,15 +2659,7 @@
           <w:b/>
           <w:lang w:val="ro-RO"/>
         </w:rPr>
-        <w:t xml:space="preserve">                                                                                              </w:t>
-      </w:r>
-      <w:r>
-        <w:rPr>
-          <w:rFonts w:cs="Calibri" w:ascii="Calibri" w:hAnsi="Calibri"/>
-          <w:b/>
-          <w:lang w:val="ro-RO"/>
-        </w:rPr>
-        <w:t xml:space="preserve">Medic examinator: {medic_examinator}                                                                                                                                                     </w:t>
+        <w:t>Medic examinator: {medic_examinator}</w:t>
       </w:r>
     </w:p>
     <w:p>

</xml_diff>